<commit_message>
test(calidad): e2e de paginacion, carga y actualizacion de seguridad
- Actualiza Spring Boot 4.1.1 a 4.1.2 y deja OSV sin incidencias
- Agrega prueba E2E de paginacion y configuracion headless
- Incorpora escenario k6 para el historial
- Regenera informe y paquetes T3
</commit_message>
<xml_diff>
--- a/docs/T3/T3_GRUPO_03.docx
+++ b/docs/T3/T3_GRUPO_03.docx
@@ -14,7 +14,7 @@
           <w:sz w:val="24"/>
           <w:lang w:val="es-ES"/>
         </w:rPr>
-        <w:t xml:space="preserve">Integración Avanzada, Seguridad y Documentación de la API</w:t>
+        <w:t xml:space="preserve">IntegraciÃ³n Avanzada, Seguridad y DocumentaciÃ³n de la API</w:t>
       </w:r>
     </w:p>
     <w:p>
@@ -29,7 +29,7 @@
           <w:sz w:val="24"/>
           <w:lang w:val="es-ES"/>
         </w:rPr>
-        <w:t xml:space="preserve">Sistema de Gestión de Inventario y Almacén — Inti Wasi</w:t>
+        <w:t xml:space="preserve">Sistema de GestiÃ³n de Inventario y AlmacÃ©n â€” Inti Wasi</w:t>
       </w:r>
     </w:p>
     <w:p>
@@ -158,7 +158,23 @@
           <w:sz w:val="24"/>
           <w:lang w:val="es-ES"/>
         </w:rPr>
-        <w:t xml:space="preserve">Misael Andrés Vergara Morales; Kevin André de La Cruz Villugas; Alvaro Luis Suica Salcedo; Israel Rodrigo Ochoa Mejía; Yul Alexander Retamozo Gutierrez; Jorge Mateo Aylas Ynciso</w:t>
+        <w:t xml:space="preserve">Misael AndrÃ©s Vergara Morales; Kevin AndrÃ© de La Cruz Villugas; Alvaro Luis Suica Salcedo; Israel Rodrigo Ochoa MejÃ</w:t>
+      </w:r>
+      <w:r>
+        <w:rPr>
+          <w:rFonts w:ascii="Times New Roman" w:hAnsi="Times New Roman"/>
+          <w:sz w:val="24"/>
+          <w:lang w:val="es-ES"/>
+        </w:rPr>
+        <w:softHyphen/>
+      </w:r>
+      <w:r>
+        <w:rPr>
+          <w:rFonts w:ascii="Times New Roman" w:hAnsi="Times New Roman"/>
+          <w:sz w:val="24"/>
+          <w:lang w:val="es-ES"/>
+        </w:rPr>
+        <w:t xml:space="preserve">a; Yul Alexander Retamozo Gutierrez; Jorge Mateo Aylas Ynciso</w:t>
       </w:r>
     </w:p>
     <w:p>
@@ -175,7 +191,7 @@
           <w:sz w:val="24"/>
           <w:lang w:val="es-ES"/>
         </w:rPr>
-        <w:t xml:space="preserve">Periodo académico:</w:t>
+        <w:t xml:space="preserve">Periodo acadÃ©mico:</w:t>
       </w:r>
       <w:r>
         <w:rPr>
@@ -208,31 +224,8 @@
           <w:sz w:val="24"/>
           <w:lang w:val="es-ES"/>
         </w:rPr>
-        <w:t xml:space="preserve">Título del proyecto:</w:t>
-      </w:r>
-      <w:r>
-        <w:rPr>
-          <w:rFonts w:ascii="Times New Roman" w:hAnsi="Times New Roman"/>
-          <w:sz w:val="24"/>
-          <w:lang w:val="es-ES"/>
-        </w:rPr>
-        <w:t xml:space="preserve"> </w:t>
-      </w:r>
-      <w:r>
-        <w:rPr>
-          <w:rFonts w:ascii="Times New Roman" w:hAnsi="Times New Roman"/>
-          <w:sz w:val="24"/>
-          <w:lang w:val="es-ES"/>
-        </w:rPr>
-        <w:t xml:space="preserve">Aplicación Web de Gestión de Inventario y Almacén — Inti Wasi</w:t>
-      </w:r>
-    </w:p>
-    <w:p>
-      <w:pPr>
-        <w:pStyle w:val="Portada"/>
-        <w:ind w:firstLine="0" w:left="0"/>
-        <w:jc w:val="center"/>
-      </w:pPr>
+        <w:t xml:space="preserve">TÃ</w:t>
+      </w:r>
       <w:r>
         <w:rPr>
           <w:rFonts w:ascii="Times New Roman" w:hAnsi="Times New Roman"/>
@@ -241,7 +234,50 @@
           <w:sz w:val="24"/>
           <w:lang w:val="es-ES"/>
         </w:rPr>
-        <w:t xml:space="preserve">Evaluación:</w:t>
+        <w:softHyphen/>
+      </w:r>
+      <w:r>
+        <w:rPr>
+          <w:rFonts w:ascii="Times New Roman" w:hAnsi="Times New Roman"/>
+          <w:b/>
+          <w:bCs/>
+          <w:sz w:val="24"/>
+          <w:lang w:val="es-ES"/>
+        </w:rPr>
+        <w:t xml:space="preserve">tulo del proyecto:</w:t>
+      </w:r>
+      <w:r>
+        <w:rPr>
+          <w:rFonts w:ascii="Times New Roman" w:hAnsi="Times New Roman"/>
+          <w:sz w:val="24"/>
+          <w:lang w:val="es-ES"/>
+        </w:rPr>
+        <w:t xml:space="preserve"> </w:t>
+      </w:r>
+      <w:r>
+        <w:rPr>
+          <w:rFonts w:ascii="Times New Roman" w:hAnsi="Times New Roman"/>
+          <w:sz w:val="24"/>
+          <w:lang w:val="es-ES"/>
+        </w:rPr>
+        <w:t xml:space="preserve">AplicaciÃ³n Web de GestiÃ³n de Inventario y AlmacÃ©n â€” Inti Wasi</w:t>
+      </w:r>
+    </w:p>
+    <w:p>
+      <w:pPr>
+        <w:pStyle w:val="Portada"/>
+        <w:ind w:firstLine="0" w:left="0"/>
+        <w:jc w:val="center"/>
+      </w:pPr>
+      <w:r>
+        <w:rPr>
+          <w:rFonts w:ascii="Times New Roman" w:hAnsi="Times New Roman"/>
+          <w:b/>
+          <w:bCs/>
+          <w:sz w:val="24"/>
+          <w:lang w:val="es-ES"/>
+        </w:rPr>
+        <w:t xml:space="preserve">EvaluaciÃ³n:</w:t>
       </w:r>
       <w:r>
         <w:rPr>
@@ -271,7 +307,7 @@
         <w:ind w:firstLine="0" w:left="0"/>
         <w:jc w:val="center"/>
       </w:pPr>
-      <w:bookmarkStart w:id="18" w:name="_introducción"/>
+      <w:bookmarkStart w:id="18" w:name="_introducciã³n"/>
       <w:r>
         <w:rPr>
           <w:rFonts w:ascii="Times New Roman" w:hAnsi="Times New Roman"/>
@@ -279,7 +315,7 @@
           <w:sz w:val="24"/>
           <w:lang w:val="es-ES"/>
         </w:rPr>
-        <w:t xml:space="preserve">Introducción</w:t>
+        <w:t xml:space="preserve">IntroducciÃ³n</w:t>
       </w:r>
       <w:bookmarkEnd w:id="18"/>
     </w:p>
@@ -291,7 +327,7 @@
         <w:rPr>
           <w:lang w:val="es-ES"/>
         </w:rPr>
-        <w:t xml:space="preserve">La Evaluación T3 consolida la integración entre el frontend Angular y el backend Spring Boot del sistema de inventario de Distribuidora Inti Wasi S.A.C. Desde la T2 se incorporaron la autenticación con JWT, la protección de rutas, el consumo de endpoints protegidos, la paginación de resultados y la documentación de la API con OpenAPI.</w:t>
+        <w:t xml:space="preserve">La EvaluaciÃ³n T3 consolida la integraciÃ³n entre el frontend Angular y el backend Spring Boot del sistema de inventario de Distribuidora Inti Wasi S.A.C. Desde la T2 se incorporaron la autenticaciÃ³n con JWT, la protecciÃ³n de rutas, el consumo de endpoints protegidos, la paginaciÃ³n de resultados y la documentaciÃ³n de la API con OpenAPI.</w:t>
       </w:r>
     </w:p>
     <w:p>
@@ -302,21 +338,33 @@
         <w:rPr>
           <w:lang w:val="es-ES"/>
         </w:rPr>
-        <w:t xml:space="preserve">El sistema cubre los procesos de usuarios, categorías, proveedores, productos, órdenes de compra, entradas, salidas, ajustes, documentos, movimientos, dashboard y reportes. La solución se encuentra en estado funcional y verificable en entorno local, con evidencia de ejecución de pruebas y capturas de cada mecanismo incorporado.</w:t>
+        <w:t xml:space="preserve">El sistema cubre los procesos de usuarios, categorÃ</w:t>
+      </w:r>
+      <w:r>
+        <w:rPr>
+          <w:lang w:val="es-ES"/>
+        </w:rPr>
+        <w:softHyphen/>
+      </w:r>
+      <w:r>
+        <w:rPr>
+          <w:lang w:val="es-ES"/>
+        </w:rPr>
+        <w:t xml:space="preserve">as, proveedores, productos, Ã³rdenes de compra, entradas, salidas, ajustes, documentos, movimientos, dashboard y reportes. La soluciÃ³n se encuentra en estado funcional y verificable en entorno local, con evidencia de ejecuciÃ³n de pruebas y capturas de cada mecanismo incorporado.</w:t>
       </w:r>
     </w:p>
     <w:p>
       <w:pPr>
         <w:pStyle w:val="Heading1"/>
       </w:pPr>
-      <w:bookmarkStart w:id="19" w:name="_5f5c4fa1420ecb9b61911184c8d122e4af967fe"/>
+      <w:bookmarkStart w:id="19" w:name="_10b7495d79d0aaa8fef220d9a540e86e7831685"/>
       <w:r>
         <w:rPr>
           <w:rFonts w:ascii="Times New Roman" w:hAnsi="Times New Roman"/>
           <w:color w:val="000000"/>
           <w:lang w:val="es-ES"/>
         </w:rPr>
-        <w:t xml:space="preserve">Arquitectura de integración</w:t>
+        <w:t xml:space="preserve">Arquitectura de integraciÃ³n</w:t>
       </w:r>
       <w:bookmarkEnd w:id="19"/>
     </w:p>
@@ -328,7 +376,7 @@
         <w:rPr>
           <w:lang w:val="es-ES"/>
         </w:rPr>
-        <w:t xml:space="preserve">La solución mantiene una arquitectura cliente-servidor desacoplada en tres capas: cliente Angular 22, API REST con Spring Boot 4.1.1 sobre Java 25, y persistencia MySQL 8. La comunicación utiliza HTTP con mensajes JSON y autenticación mediante token Bearer.</w:t>
+        <w:t xml:space="preserve">La soluciÃ³n mantiene una arquitectura cliente-servidor desacoplada en tres capas: cliente Angular 22, API REST con Spring Boot 4.1.2 sobre Java 25, y persistencia MySQL 8. La comunicaciÃ³n utiliza HTTP con mensajes JSON y autenticaciÃ³n mediante token Bearer.</w:t>
       </w:r>
     </w:p>
     <w:p>
@@ -340,7 +388,7 @@
           <wp:inline>
             <wp:extent cx="5727700" cy="2925940"/>
             <wp:effectExtent b="0" l="0" r="0" t="0"/>
-            <wp:docPr descr="Figura 1. Arquitectura de integración cliente-servidor del sistema Inti Wasi." title="" id="21" name="Picture"/>
+            <wp:docPr descr="Figura 1. Arquitectura de integraciÃ³n cliente-servidor del sistema Inti Wasi." title="" id="21" name="Picture"/>
             <a:graphic>
               <a:graphicData uri="http://schemas.openxmlformats.org/drawingml/2006/picture">
                 <pic:pic>
@@ -402,7 +450,7 @@
           <w:iCs/>
           <w:lang w:val="es-ES"/>
         </w:rPr>
-        <w:t xml:space="preserve">Arquitectura de integración cliente-servidor del sistema Inti Wasi.</w:t>
+        <w:t xml:space="preserve">Arquitectura de integraciÃ³n cliente-servidor del sistema Inti Wasi.</w:t>
       </w:r>
     </w:p>
     <w:p>
@@ -413,7 +461,7 @@
         <w:rPr>
           <w:lang w:val="es-ES"/>
         </w:rPr>
-        <w:t xml:space="preserve">El cliente organiza su código en</w:t>
+        <w:t xml:space="preserve">El cliente organiza su cÃ³digo en</w:t>
       </w:r>
       <w:r>
         <w:rPr>
@@ -463,7 +511,7 @@
         <w:rPr>
           <w:lang w:val="es-ES"/>
         </w:rPr>
-        <w:t xml:space="preserve">(módulos funcionales),</w:t>
+        <w:t xml:space="preserve">(mÃ³dulos funcionales),</w:t>
       </w:r>
       <w:r>
         <w:rPr>
@@ -520,14 +568,14 @@
       <w:pPr>
         <w:pStyle w:val="Heading1"/>
       </w:pPr>
-      <w:bookmarkStart w:id="23" w:name="_eead2a89c18ba9ccd34e3c1773bef7bbd443561"/>
+      <w:bookmarkStart w:id="23" w:name="_a30d792f84e0049fea1bd8c611a0f8fd4f05957"/>
       <w:r>
         <w:rPr>
           <w:rFonts w:ascii="Times New Roman" w:hAnsi="Times New Roman"/>
           <w:color w:val="000000"/>
           <w:lang w:val="es-ES"/>
         </w:rPr>
-        <w:t xml:space="preserve">Diseño de interfaces</w:t>
+        <w:t xml:space="preserve">DiseÃ±o de interfaces</w:t>
       </w:r>
       <w:bookmarkEnd w:id="23"/>
     </w:p>
@@ -539,7 +587,7 @@
         <w:rPr>
           <w:lang w:val="es-ES"/>
         </w:rPr>
-        <w:t xml:space="preserve">La interfaz utiliza Angular Material y un sistema visual propio con temas claro y oscuro. La navegación se organiza por rol: el Administrador accede a dashboard, reportes y ajustes; el Operador accede a documentos, movimientos y operaciones de almacén.</w:t>
+        <w:t xml:space="preserve">La interfaz utiliza Angular Material y un sistema visual propio con temas claro y oscuro. La navegaciÃ³n se organiza por rol: el Administrador accede a dashboard, reportes y ajustes; el Operador accede a documentos, movimientos y operaciones de almacÃ©n.</w:t>
       </w:r>
     </w:p>
     <w:p>
@@ -551,7 +599,7 @@
           <wp:inline>
             <wp:extent cx="5727700" cy="3579812"/>
             <wp:effectExtent b="0" l="0" r="0" t="0"/>
-            <wp:docPr descr="Figura 2. Pantalla de inicio de sesión." title="" id="25" name="Picture"/>
+            <wp:docPr descr="Figura 2. Pantalla de inicio de sesiÃ³n." title="" id="25" name="Picture"/>
             <a:graphic>
               <a:graphicData uri="http://schemas.openxmlformats.org/drawingml/2006/picture">
                 <pic:pic>
@@ -613,7 +661,7 @@
           <w:iCs/>
           <w:lang w:val="es-ES"/>
         </w:rPr>
-        <w:t xml:space="preserve">Pantalla de inicio de sesión.</w:t>
+        <w:t xml:space="preserve">Pantalla de inicio de sesiÃ³n.</w:t>
       </w:r>
     </w:p>
     <w:p>
@@ -625,7 +673,7 @@
           <wp:inline>
             <wp:extent cx="5727700" cy="4184403"/>
             <wp:effectExtent b="0" l="0" r="0" t="0"/>
-            <wp:docPr descr="Figura 3. Panel principal con sesión autenticada." title="" id="28" name="Picture"/>
+            <wp:docPr descr="Figura 3. Panel principal con sesiÃ³n autenticada." title="" id="28" name="Picture"/>
             <a:graphic>
               <a:graphicData uri="http://schemas.openxmlformats.org/drawingml/2006/picture">
                 <pic:pic>
@@ -687,7 +735,7 @@
           <w:iCs/>
           <w:lang w:val="es-ES"/>
         </w:rPr>
-        <w:t xml:space="preserve">Panel principal con sesión autenticada.</w:t>
+        <w:t xml:space="preserve">Panel principal con sesiÃ³n autenticada.</w:t>
       </w:r>
     </w:p>
     <w:p>
@@ -698,21 +746,33 @@
         <w:rPr>
           <w:lang w:val="es-ES"/>
         </w:rPr>
-        <w:t xml:space="preserve">El flujo de navegación parte del login, continúa al panel principal y desde allí a los módulos habilitados según el rol. Las rutas no autorizadas redirigen al login o a la pantalla de acceso denegado.</w:t>
+        <w:t xml:space="preserve">El flujo de navegaciÃ³n parte del login, continÃºa al panel principal y desde allÃ</w:t>
+      </w:r>
+      <w:r>
+        <w:rPr>
+          <w:lang w:val="es-ES"/>
+        </w:rPr>
+        <w:softHyphen/>
+      </w:r>
+      <w:r>
+        <w:rPr>
+          <w:lang w:val="es-ES"/>
+        </w:rPr>
+        <w:t xml:space="preserve"> a los mÃ³dulos habilitados segÃºn el rol. Las rutas no autorizadas redirigen al login o a la pantalla de acceso denegado.</w:t>
       </w:r>
     </w:p>
     <w:p>
       <w:pPr>
         <w:pStyle w:val="Heading1"/>
       </w:pPr>
-      <w:bookmarkStart w:id="30" w:name="_cdc91eeafc4798bfbbe63a54fbce4521f4b3dc4"/>
+      <w:bookmarkStart w:id="30" w:name="_e33c47aafde83448911ba09f4f92964a4af17ca"/>
       <w:r>
         <w:rPr>
           <w:rFonts w:ascii="Times New Roman" w:hAnsi="Times New Roman"/>
           <w:color w:val="000000"/>
           <w:lang w:val="es-ES"/>
         </w:rPr>
-        <w:t xml:space="preserve">Relación con el ODS 9</w:t>
+        <w:t xml:space="preserve">RelaciÃ³n con el ODS 9</w:t>
       </w:r>
       <w:bookmarkEnd w:id="30"/>
     </w:p>
@@ -724,7 +784,7 @@
         <w:rPr>
           <w:lang w:val="es-ES"/>
         </w:rPr>
-        <w:t xml:space="preserve">El proyecto contribuye al Objetivo de Desarrollo Sostenible 9 en dos metas. La meta 9.4 se aborda al modernizar la infraestructura tecnológica de la distribuidora con una plataforma web que sustituye registros manuales y hojas de cálculo. La meta 9.5 se cumple al incorporar innovación tecnológica en una pequeña empresa comercial mediante control de inventario, trazabilidad y reportes.</w:t>
+        <w:t xml:space="preserve">El proyecto contribuye al Objetivo de Desarrollo Sostenible 9 en dos metas. La meta 9.4 se aborda al modernizar la infraestructura tecnolÃ³gica de la distribuidora con una plataforma web que sustituye registros manuales y hojas de cÃ¡lculo. La meta 9.5 se cumple al incorporar innovaciÃ³n tecnolÃ³gica en una pequeÃ±a empresa comercial mediante control de inventario, trazabilidad y reportes.</w:t>
       </w:r>
     </w:p>
     <w:p>
@@ -735,7 +795,7 @@
         <w:rPr>
           <w:lang w:val="es-ES"/>
         </w:rPr>
-        <w:t xml:space="preserve">Los beneficios esperados son la reducción de discrepancias de stock, la conservación del historial de movimientos, la disminución de tiempos de atención y la disponibilidad de información para decisiones de abastecimiento.</w:t>
+        <w:t xml:space="preserve">Los beneficios esperados son la reducciÃ³n de discrepancias de stock, la conservaciÃ³n del historial de movimientos, la disminuciÃ³n de tiempos de atenciÃ³n y la disponibilidad de informaciÃ³n para decisiones de abastecimiento.</w:t>
       </w:r>
     </w:p>
     <w:p>
@@ -761,7 +821,7 @@
         <w:rPr>
           <w:lang w:val="es-ES"/>
         </w:rPr>
-        <w:t xml:space="preserve">La autenticación se basa en JSON Web Tokens firmados con HMAC. El flujo es el siguiente:</w:t>
+        <w:t xml:space="preserve">La autenticaciÃ³n se basa en JSON Web Tokens firmados con HMAC. El flujo es el siguiente:</w:t>
       </w:r>
     </w:p>
     <w:p>
@@ -776,7 +836,19 @@
         <w:rPr>
           <w:lang w:val="es-ES"/>
         </w:rPr>
-        <w:t xml:space="preserve">El usuario envía correo y contraseña a</w:t>
+        <w:t xml:space="preserve">El usuario envÃ</w:t>
+      </w:r>
+      <w:r>
+        <w:rPr>
+          <w:lang w:val="es-ES"/>
+        </w:rPr>
+        <w:softHyphen/>
+      </w:r>
+      <w:r>
+        <w:rPr>
+          <w:lang w:val="es-ES"/>
+        </w:rPr>
+        <w:t xml:space="preserve">a correo y contraseÃ±a a</w:t>
       </w:r>
       <w:r>
         <w:rPr>
@@ -810,7 +882,7 @@
         <w:rPr>
           <w:lang w:val="es-ES"/>
         </w:rPr>
-        <w:t xml:space="preserve">El backend valida las credenciales con BCrypt y verifica que la cuenta esté activa.</w:t>
+        <w:t xml:space="preserve">El backend valida las credenciales con BCrypt y verifica que la cuenta estÃ© activa.</w:t>
       </w:r>
     </w:p>
     <w:p>
@@ -825,7 +897,7 @@
         <w:rPr>
           <w:lang w:val="es-ES"/>
         </w:rPr>
-        <w:t xml:space="preserve">Se genera un token con expiración configurable y se devuelve al cliente.</w:t>
+        <w:t xml:space="preserve">Se genera un token con expiraciÃ³n configurable y se devuelve al cliente.</w:t>
       </w:r>
     </w:p>
     <w:p>
@@ -880,7 +952,7 @@
         <w:rPr>
           <w:lang w:val="es-ES"/>
         </w:rPr>
-        <w:t xml:space="preserve">La sesión se almacena en</w:t>
+        <w:t xml:space="preserve">La sesiÃ³n se almacena en</w:t>
       </w:r>
       <w:r>
         <w:rPr>
@@ -975,7 +1047,7 @@
         <w:rPr>
           <w:lang w:val="es-ES"/>
         </w:rPr>
-        <w:t xml:space="preserve">La protección de rutas se implementa con</w:t>
+        <w:t xml:space="preserve">La protecciÃ³n de rutas se implementa con</w:t>
       </w:r>
       <w:r>
         <w:rPr>
@@ -994,7 +1066,7 @@
         <w:rPr>
           <w:lang w:val="es-ES"/>
         </w:rPr>
-        <w:t xml:space="preserve">, que bloquea el acceso sin sesión válida, y</w:t>
+        <w:t xml:space="preserve">, que bloquea el acceso sin sesiÃ³n vÃ¡lida, y</w:t>
       </w:r>
       <w:r>
         <w:rPr>
@@ -1013,7 +1085,7 @@
         <w:rPr>
           <w:lang w:val="es-ES"/>
         </w:rPr>
-        <w:t xml:space="preserve">, que impide mostrar el login a un usuario autenticado. El cierre de sesión elimina el token y redirige al login. La inactividad de quince minutos muestra un aviso de treinta segundos antes de cerrar la sesión.</w:t>
+        <w:t xml:space="preserve">, que impide mostrar el login a un usuario autenticado. El cierre de sesiÃ³n elimina el token y redirige al login. La inactividad de quince minutos muestra un aviso de treinta segundos antes de cerrar la sesiÃ³n.</w:t>
       </w:r>
     </w:p>
     <w:p>
@@ -1025,7 +1097,7 @@
           <wp:inline>
             <wp:extent cx="5727700" cy="3579812"/>
             <wp:effectExtent b="0" l="0" r="0" t="0"/>
-            <wp:docPr descr="Figura 4. Redirección automática al login al solicitar una ruta protegida sin sesión." title="" id="33" name="Picture"/>
+            <wp:docPr descr="Figura 4. RedirecciÃ³n automÃ¡tica al login al solicitar una ruta protegida sin sesiÃ³n." title="" id="33" name="Picture"/>
             <a:graphic>
               <a:graphicData uri="http://schemas.openxmlformats.org/drawingml/2006/picture">
                 <pic:pic>
@@ -1087,21 +1159,21 @@
           <w:iCs/>
           <w:lang w:val="es-ES"/>
         </w:rPr>
-        <w:t xml:space="preserve">Redirección automática al login al solicitar una ruta protegida sin sesión.</w:t>
+        <w:t xml:space="preserve">RedirecciÃ³n automÃ¡tica al login al solicitar una ruta protegida sin sesiÃ³n.</w:t>
       </w:r>
     </w:p>
     <w:p>
       <w:pPr>
         <w:pStyle w:val="Heading1"/>
       </w:pPr>
-      <w:bookmarkStart w:id="35" w:name="_38fcd4c2d003617cf669a534af8bbda5745a3d1"/>
+      <w:bookmarkStart w:id="35" w:name="_9e7a41f49aded9ef3fc8459fd9d5739bee9b49f"/>
       <w:r>
         <w:rPr>
           <w:rFonts w:ascii="Times New Roman" w:hAnsi="Times New Roman"/>
           <w:color w:val="000000"/>
           <w:lang w:val="es-ES"/>
         </w:rPr>
-        <w:t xml:space="preserve">Integración frontend-backend</w:t>
+        <w:t xml:space="preserve">IntegraciÃ³n frontend-backend</w:t>
       </w:r>
       <w:bookmarkEnd w:id="35"/>
     </w:p>
@@ -1132,7 +1204,7 @@
         <w:rPr>
           <w:lang w:val="es-ES"/>
         </w:rPr>
-        <w:t xml:space="preserve">. Cada módulo cuenta con un servicio que centraliza las operaciones y transforma los errores HTTP en mensajes para el usuario.</w:t>
+        <w:t xml:space="preserve">. Cada mÃ³dulo cuenta con un servicio que centraliza las operaciones y transforma los errores HTTP en mensajes para el usuario.</w:t>
       </w:r>
     </w:p>
     <w:p>
@@ -1189,7 +1261,7 @@
               <w:rPr>
                 <w:lang w:val="es-ES"/>
               </w:rPr>
-              <w:t xml:space="preserve">Módulo</w:t>
+              <w:t xml:space="preserve">MÃ³dulo</w:t>
             </w:r>
           </w:p>
         </w:tc>
@@ -1233,7 +1305,7 @@
               <w:rPr>
                 <w:lang w:val="es-ES"/>
               </w:rPr>
-              <w:t xml:space="preserve">Autenticación</w:t>
+              <w:t xml:space="preserve">AutenticaciÃ³n</w:t>
             </w:r>
           </w:p>
         </w:tc>
@@ -1413,7 +1485,7 @@
               <w:rPr>
                 <w:lang w:val="es-ES"/>
               </w:rPr>
-              <w:t xml:space="preserve">Órdenes de compra</w:t>
+              <w:t xml:space="preserve">Ã“rdenes de compra</w:t>
             </w:r>
           </w:p>
         </w:tc>
@@ -1565,21 +1637,21 @@
         <w:rPr>
           <w:lang w:val="es-ES"/>
         </w:rPr>
-        <w:t xml:space="preserve">Los errores 401 cierran la sesión y redirigen al login; los errores 403 muestran acceso denegado; los errores 400 presentan el mensaje de validación del backend.</w:t>
+        <w:t xml:space="preserve">Los errores 401 cierran la sesiÃ³n y redirigen al login; los errores 403 muestran acceso denegado; los errores 400 presentan el mensaje de validaciÃ³n del backend.</w:t>
       </w:r>
     </w:p>
     <w:p>
       <w:pPr>
         <w:pStyle w:val="Heading1"/>
       </w:pPr>
-      <w:bookmarkStart w:id="36" w:name="_paginación"/>
+      <w:bookmarkStart w:id="36" w:name="_paginaciã³n"/>
       <w:r>
         <w:rPr>
           <w:rFonts w:ascii="Times New Roman" w:hAnsi="Times New Roman"/>
           <w:color w:val="000000"/>
           <w:lang w:val="es-ES"/>
         </w:rPr>
-        <w:t xml:space="preserve">Paginación</w:t>
+        <w:t xml:space="preserve">PaginaciÃ³n</w:t>
       </w:r>
       <w:bookmarkEnd w:id="36"/>
     </w:p>
@@ -1616,7 +1688,7 @@
         <w:rPr>
           <w:lang w:val="es-ES"/>
         </w:rPr>
-        <w:t xml:space="preserve">con parámetros</w:t>
+        <w:t xml:space="preserve">con parÃ¡metros</w:t>
       </w:r>
       <w:r>
         <w:rPr>
@@ -1786,7 +1858,7 @@
         <w:rPr>
           <w:lang w:val="es-ES"/>
         </w:rPr>
-        <w:t xml:space="preserve">. El frontend consume la página solicitada y presenta los resultados con</w:t>
+        <w:t xml:space="preserve">. El frontend consume la pÃ¡gina solicitada y presenta los resultados con</w:t>
       </w:r>
       <w:r>
         <w:rPr>
@@ -1805,7 +1877,7 @@
         <w:rPr>
           <w:lang w:val="es-ES"/>
         </w:rPr>
-        <w:t xml:space="preserve">, con tamaños de página de 10, 20 y 50 registros.</w:t>
+        <w:t xml:space="preserve">, con tamaÃ±os de pÃ¡gina de 10, 20 y 50 registros.</w:t>
       </w:r>
     </w:p>
     <w:p>
@@ -1817,7 +1889,7 @@
           <wp:inline>
             <wp:extent cx="5727700" cy="10639998"/>
             <wp:effectExtent b="0" l="0" r="0" t="0"/>
-            <wp:docPr descr="Figura 5. Listado de movimientos con paginación del lado del servidor." title="" id="38" name="Picture"/>
+            <wp:docPr descr="Figura 5. Listado de movimientos con paginaciÃ³n del lado del servidor." title="" id="38" name="Picture"/>
             <a:graphic>
               <a:graphicData uri="http://schemas.openxmlformats.org/drawingml/2006/picture">
                 <pic:pic>
@@ -1879,7 +1951,7 @@
           <w:iCs/>
           <w:lang w:val="es-ES"/>
         </w:rPr>
-        <w:t xml:space="preserve">Listado de movimientos con paginación del lado del servidor.</w:t>
+        <w:t xml:space="preserve">Listado de movimientos con paginaciÃ³n del lado del servidor.</w:t>
       </w:r>
     </w:p>
     <w:p>
@@ -1890,21 +1962,21 @@
         <w:rPr>
           <w:lang w:val="es-ES"/>
         </w:rPr>
-        <w:t xml:space="preserve">La paginación reduce el volumen de datos transferidos y mantiene los filtros de fecha, producto, tipo de documento y usuario.</w:t>
+        <w:t xml:space="preserve">La paginaciÃ³n reduce el volumen de datos transferidos y mantiene los filtros de fecha, producto, tipo de documento y usuario.</w:t>
       </w:r>
     </w:p>
     <w:p>
       <w:pPr>
         <w:pStyle w:val="Heading1"/>
       </w:pPr>
-      <w:bookmarkStart w:id="40" w:name="_5144c362b7abb2559fbf74efa37d12f1a1b1b58"/>
+      <w:bookmarkStart w:id="40" w:name="_76776823ab2ae0c665a332cfd2bd33edf8430d1"/>
       <w:r>
         <w:rPr>
           <w:rFonts w:ascii="Times New Roman" w:hAnsi="Times New Roman"/>
           <w:color w:val="000000"/>
           <w:lang w:val="es-ES"/>
         </w:rPr>
-        <w:t xml:space="preserve">Documentación de la API</w:t>
+        <w:t xml:space="preserve">DocumentaciÃ³n de la API</w:t>
       </w:r>
       <w:bookmarkEnd w:id="40"/>
     </w:p>
@@ -1916,7 +1988,7 @@
         <w:rPr>
           <w:lang w:val="es-ES"/>
         </w:rPr>
-        <w:t xml:space="preserve">La documentación se genera con springdoc-openapi 3.2.0. La interfaz Swagger UI está disponible en</w:t>
+        <w:t xml:space="preserve">La documentaciÃ³n se genera con springdoc-openapi 3.2.0. La interfaz Swagger UI estÃ¡ disponible en</w:t>
       </w:r>
       <w:r>
         <w:rPr>
@@ -1960,7 +2032,7 @@
         <w:rPr>
           <w:lang w:val="es-ES"/>
         </w:rPr>
-        <w:t xml:space="preserve">. El esquema incluye autenticación Bearer para probar endpoints protegidos desde la interfaz.</w:t>
+        <w:t xml:space="preserve">. El esquema incluye autenticaciÃ³n Bearer para probar endpoints protegidos desde la interfaz.</w:t>
       </w:r>
     </w:p>
     <w:p>
@@ -1972,7 +2044,7 @@
           <wp:inline>
             <wp:extent cx="5727700" cy="3579812"/>
             <wp:effectExtent b="0" l="0" r="0" t="0"/>
-            <wp:docPr descr="Figura 6. Swagger UI con los servicios documentados y el esquema de autorización JWT." title="" id="42" name="Picture"/>
+            <wp:docPr descr="Figura 6. Swagger UI con los servicios documentados y el esquema de autorizaciÃ³n JWT." title="" id="42" name="Picture"/>
             <a:graphic>
               <a:graphicData uri="http://schemas.openxmlformats.org/drawingml/2006/picture">
                 <pic:pic>
@@ -2034,7 +2106,7 @@
           <w:iCs/>
           <w:lang w:val="es-ES"/>
         </w:rPr>
-        <w:t xml:space="preserve">Swagger UI con los servicios documentados y el esquema de autorización JWT.</w:t>
+        <w:t xml:space="preserve">Swagger UI con los servicios documentados y el esquema de autorizaciÃ³n JWT.</w:t>
       </w:r>
     </w:p>
     <w:p>
@@ -2045,7 +2117,7 @@
         <w:rPr>
           <w:lang w:val="es-ES"/>
         </w:rPr>
-        <w:t xml:space="preserve">La documentación expone 38 rutas agrupadas por controlador y permite ejecutar solicitudes con el token obtenido en el login.</w:t>
+        <w:t xml:space="preserve">La documentaciÃ³n expone 38 rutas agrupadas por controlador y permite ejecutar solicitudes con el token obtenido en el login.</w:t>
       </w:r>
     </w:p>
     <w:p>
@@ -2205,6 +2277,50 @@
               <w:rPr>
                 <w:lang w:val="es-ES"/>
               </w:rPr>
+              <w:t xml:space="preserve">Pruebas de integración backend</w:t>
+            </w:r>
+          </w:p>
+        </w:tc>
+        <w:tc>
+          <w:tcPr/>
+          <w:p>
+            <w:pPr>
+              <w:pStyle w:val="Compact"/>
+            </w:pPr>
+            <w:r>
+              <w:rPr>
+                <w:lang w:val="es-ES"/>
+              </w:rPr>
+              <w:t xml:space="preserve">MockMvc</w:t>
+            </w:r>
+          </w:p>
+        </w:tc>
+        <w:tc>
+          <w:tcPr/>
+          <w:p>
+            <w:pPr>
+              <w:pStyle w:val="Compact"/>
+            </w:pPr>
+            <w:r>
+              <w:rPr>
+                <w:lang w:val="es-ES"/>
+              </w:rPr>
+              <w:t xml:space="preserve">6 aprobadas, 0 fallos</w:t>
+            </w:r>
+          </w:p>
+        </w:tc>
+      </w:tr>
+      <w:tr>
+        <w:tc>
+          <w:tcPr/>
+          <w:p>
+            <w:pPr>
+              <w:pStyle w:val="Compact"/>
+            </w:pPr>
+            <w:r>
+              <w:rPr>
+                <w:lang w:val="es-ES"/>
+              </w:rPr>
               <w:t xml:space="preserve">Pruebas unitarias frontend</w:t>
             </w:r>
           </w:p>
@@ -2249,7 +2365,7 @@
               <w:rPr>
                 <w:lang w:val="es-ES"/>
               </w:rPr>
-              <w:t xml:space="preserve">Compilación frontend</w:t>
+              <w:t xml:space="preserve">CompilaciÃ³n frontend</w:t>
             </w:r>
           </w:p>
         </w:tc>
@@ -2293,7 +2409,7 @@
               <w:rPr>
                 <w:lang w:val="es-ES"/>
               </w:rPr>
-              <w:t xml:space="preserve">Verificación funcional</w:t>
+              <w:t xml:space="preserve">VerificaciÃ³n funcional</w:t>
             </w:r>
           </w:p>
         </w:tc>
@@ -2321,7 +2437,7 @@
               <w:rPr>
                 <w:lang w:val="es-ES"/>
               </w:rPr>
-              <w:t xml:space="preserve">Login, guard, paginación, CRUD, Swagger y logout</w:t>
+              <w:t xml:space="preserve">Login, guard, paginaciÃ³n, CRUD, Swagger y logout</w:t>
             </w:r>
           </w:p>
         </w:tc>
@@ -2336,7 +2452,7 @@
           <wp:inline>
             <wp:extent cx="5727700" cy="5711789"/>
             <wp:effectExtent b="0" l="0" r="0" t="0"/>
-            <wp:docPr descr="Figura 7. Operaciones CRUD del módulo de productos." title="" id="46" name="Picture"/>
+            <wp:docPr descr="Figura 7. Operaciones CRUD del mÃ³dulo de productos." title="" id="46" name="Picture"/>
             <a:graphic>
               <a:graphicData uri="http://schemas.openxmlformats.org/drawingml/2006/picture">
                 <pic:pic>
@@ -2398,7 +2514,7 @@
           <w:iCs/>
           <w:lang w:val="es-ES"/>
         </w:rPr>
-        <w:t xml:space="preserve">Operaciones CRUD del módulo de productos.</w:t>
+        <w:t xml:space="preserve">Operaciones CRUD del mÃ³dulo de productos.</w:t>
       </w:r>
     </w:p>
     <w:p>
@@ -2410,7 +2526,7 @@
           <wp:inline>
             <wp:extent cx="5727700" cy="3579812"/>
             <wp:effectExtent b="0" l="0" r="0" t="0"/>
-            <wp:docPr descr="Figura 8. Cierre de sesión y retorno al login." title="" id="49" name="Picture"/>
+            <wp:docPr descr="Figura 8. Cierre de sesiÃ³n y retorno al login." title="" id="49" name="Picture"/>
             <a:graphic>
               <a:graphicData uri="http://schemas.openxmlformats.org/drawingml/2006/picture">
                 <pic:pic>
@@ -2472,7 +2588,7 @@
           <w:iCs/>
           <w:lang w:val="es-ES"/>
         </w:rPr>
-        <w:t xml:space="preserve">Cierre de sesión y retorno al login.</w:t>
+        <w:t xml:space="preserve">Cierre de sesiÃ³n y retorno al login.</w:t>
       </w:r>
     </w:p>
     <w:p>
@@ -2483,7 +2599,7 @@
         <w:rPr>
           <w:lang w:val="es-ES"/>
         </w:rPr>
-        <w:t xml:space="preserve">Las capturas se generaron sobre la aplicación en ejecución con backend, frontend y base de datos reales.</w:t>
+        <w:t xml:space="preserve">Las capturas se generaron sobre la aplicaciÃ³n en ejecuciÃ³n con backend, frontend y base de datos reales.</w:t>
       </w:r>
     </w:p>
     <w:p>
@@ -2513,7 +2629,19 @@
         <w:rPr>
           <w:lang w:val="es-ES"/>
         </w:rPr>
-        <w:t xml:space="preserve">La autenticación con JWT y la política stateless permiten proteger los servicios sin mantener estado en el servidor.</w:t>
+        <w:t xml:space="preserve">La autenticaciÃ³n con JWT y la polÃ</w:t>
+      </w:r>
+      <w:r>
+        <w:rPr>
+          <w:lang w:val="es-ES"/>
+        </w:rPr>
+        <w:softHyphen/>
+      </w:r>
+      <w:r>
+        <w:rPr>
+          <w:lang w:val="es-ES"/>
+        </w:rPr>
+        <w:t xml:space="preserve">tica stateless permiten proteger los servicios sin mantener estado en el servidor.</w:t>
       </w:r>
     </w:p>
     <w:p>
@@ -2528,7 +2656,7 @@
         <w:rPr>
           <w:lang w:val="es-ES"/>
         </w:rPr>
-        <w:t xml:space="preserve">Los guards de Angular y el interceptor HTTP complementan la seguridad del backend y evitan el acceso a rutas sin sesión válida.</w:t>
+        <w:t xml:space="preserve">Los guards de Angular y el interceptor HTTP complementan la seguridad del backend y evitan el acceso a rutas sin sesiÃ³n vÃ¡lida.</w:t>
       </w:r>
     </w:p>
     <w:p>
@@ -2543,7 +2671,7 @@
         <w:rPr>
           <w:lang w:val="es-ES"/>
         </w:rPr>
-        <w:t xml:space="preserve">La paginación del lado del servidor con</w:t>
+        <w:t xml:space="preserve">La paginaciÃ³n del lado del servidor con</w:t>
       </w:r>
       <w:r>
         <w:rPr>
@@ -2583,7 +2711,7 @@
         <w:rPr>
           <w:lang w:val="es-ES"/>
         </w:rPr>
-        <w:t xml:space="preserve">La incorporación de Swagger/OpenAPI facilita la verificación de contratos y reduce el tiempo de integración con el frontend.</w:t>
+        <w:t xml:space="preserve">La incorporaciÃ³n de Swagger/OpenAPI facilita la verificaciÃ³n de contratos y reduce el tiempo de integraciÃ³n con el frontend.</w:t>
       </w:r>
     </w:p>
     <w:p>
@@ -2598,7 +2726,7 @@
         <w:rPr>
           <w:lang w:val="es-ES"/>
         </w:rPr>
-        <w:t xml:space="preserve">La ejecución conjunta de 16 pruebas backend y 76 frontend, junto con las capturas funcionales, evidencia una integración estable del sistema.</w:t>
+        <w:t xml:space="preserve">La ejecuciÃ³n conjunta de 22 pruebas backend y 76 frontend, junto con las capturas funcionales, evidencia una integraciÃ³n estable del sistema.</w:t>
       </w:r>
     </w:p>
     <w:p>

</xml_diff>

<commit_message>
fix(api): devolver 404 en rutas inexistentes y evidencia ZAP
- Agrega manejadores para NoResourceFoundException y metodo no soportado
- Corrige respuestas 500 detectadas por ZAP
- Agrega prueba de regresion para rutas inexistentes
- Documenta resultados DAST y actualiza entregables T3
</commit_message>
<xml_diff>
--- a/docs/T3/T3_GRUPO_03.docx
+++ b/docs/T3/T3_GRUPO_03.docx
@@ -2305,7 +2305,7 @@
               <w:rPr>
                 <w:lang w:val="es-ES"/>
               </w:rPr>
-              <w:t xml:space="preserve">6 aprobadas, 0 fallos</w:t>
+              <w:t xml:space="preserve">7 aprobadas, 0 fallos</w:t>
             </w:r>
           </w:p>
         </w:tc>
@@ -2726,7 +2726,7 @@
         <w:rPr>
           <w:lang w:val="es-ES"/>
         </w:rPr>
-        <w:t xml:space="preserve">La ejecuciÃ³n conjunta de 22 pruebas backend y 76 frontend, junto con las capturas funcionales, evidencia una integraciÃ³n estable del sistema.</w:t>
+        <w:t xml:space="preserve">La ejecuciÃ³n conjunta de 23 pruebas backend y 76 frontend, junto con las capturas funcionales, evidencia una integraciÃ³n estable del sistema.</w:t>
       </w:r>
     </w:p>
     <w:p>

</xml_diff>